<commit_message>
Add units-lapse-on-leaving rule and personal undertaking
Contract (Konsultavtal_CEO_template): performance-units paragraph now refers to
the framework instead of describing the mechanics, and states the units are
valid only while the named person works at the firm — lapsing with immediate
effect on departure regardless of good/bad leaver. Adds a 'Personligt
åtagande' (personal undertaking / key-person) clause binding the individual
personally, and a signature capacity line.

Framework (PDF + DOCX): new section 8 'Performance units and leaving the firm'
stating units are not vested or transferable and lapse on leaving regardless
of good/bad leaver; Governance renumbered to 9.

Co-Authored-By: Claude Opus 4.8 <noreply@anthropic.com>
Claude-Session: https://claude.ai/code/session_01K14qB8MpeJ8Pk8H1GeEUV4
</commit_message>
<xml_diff>
--- a/Konsultavtal_CEO_template.docx
+++ b/Konsultavtal_CEO_template.docx
@@ -190,6 +190,29 @@
           <w:sz w:val="24"/>
         </w:rPr>
         <w:t>Konsulten åtar sig att som självständig konsult tillhandahålla tjänster åt Uppdragsgivaren genom att [Konsultens namn] verkar som verkställande direktör (CEO) för Uppdragsgivaren. I rollen ingår att leda och ansvara för bolagets löpande verksamhet och förvaltning i enlighet med styrelsens och Uppdragsgivarens instruktioner samt gällande rätt.</w:t>
+      </w:r>
+    </w:p>
+    <w:p>
+      <w:pPr>
+        <w:pStyle w:val="Brdtext2"/>
+      </w:pPr>
+      <w:r>
+        <w:rPr>
+          <w:b/>
+          <w:sz w:val="24"/>
+        </w:rPr>
+        <w:t>Personligt åtagande</w:t>
+      </w:r>
+    </w:p>
+    <w:p>
+      <w:pPr>
+        <w:pStyle w:val="Brdtext"/>
+      </w:pPr>
+      <w:r>
+        <w:rPr>
+          <w:sz w:val="24"/>
+        </w:rPr>
+        <w:t>Tjänsterna är av personlig natur och ska utföras personligen av [Konsultens namn]. [Konsultens namn] gör genom detta avtal ett personligt åtagande gentemot Uppdragsgivaren att utföra uppdraget och att iaktta de skyldigheter som följer av avtalet, inklusive sekretess och de villkor som gäller för prestationsenheterna. Konsulten får inte ersätta [Konsultens namn] med annan person eller överlåta utförandet av tjänsterna utan Uppdragsgivarens skriftliga medgivande. [Konsultens namn] undertecknar detta avtal såväl för Konsultens räkning som personligen för att bekräfta detta åtagande.</w:t>
       </w:r>
     </w:p>
     <w:p>
@@ -288,7 +311,7 @@
         <w:rPr>
           <w:sz w:val="24"/>
         </w:rPr>
-        <w:t>Utöver den fasta ersättningen tilldelas Konsulten 8 prestationsenheter (performance units) i enlighet med Uppdragsgivarens vid var tid gällande ersättningssystem. Prestationsenheterna berättigar Konsulten till en andel av den prestationsbaserade ersättningspool som utgörs av 60 % av fondens resultatbaserade avgift (performance fee). Konsultens andel beräknas som antalet tilldelade prestationsenheter (8) multiplicerat med värdet av en prestationsenhet, där värdet av en prestationsenhet utgörs av ersättningspoolen delad med det totala antalet prestationsenheter i firman. Antalet prestationsenheter och systemets närmare utformning kan komma att justeras över tid i enlighet med ersättningssystemet.</w:t>
+        <w:t>Utöver den fasta ersättningen tilldelas Konsulten 8 prestationsenheter (performance units) i enlighet med Uppdragsgivarens vid var tid gällande ersättningssystem, ”Roles, Responsibilities &amp; Performance Compensation Framework”. Prestationsenheterna är giltiga endast så länge [Konsultens namn] personligen arbetar för och utför tjänsterna åt Uppdragsgivaren. När [Konsultens namn] upphör att arbeta för Uppdragsgivaren upphör samtliga prestationsenheter och därtill hörande rättigheter att gälla med omedelbar verkan, oavsett om [Konsultens namn] anses vara en good leaver eller bad leaver. Prestationsenheterna kan inte överlåtas.</w:t>
       </w:r>
     </w:p>
     <w:p>
@@ -901,6 +924,21 @@
           <w:lang w:val="en-GB"/>
         </w:rPr>
         <w:t>[Konsultens namn]</w:t>
+      </w:r>
+    </w:p>
+    <w:p>
+      <w:pPr>
+        <w:pStyle w:val="Brdtext"/>
+      </w:pPr>
+      <w:r>
+        <w:rPr>
+          <w:sz w:val="24"/>
+        </w:rPr>
+        <w:t>för Uppdragsgivaren</w:t>
+        <w:tab/>
+        <w:tab/>
+        <w:tab/>
+        <w:t>för [Bolagsnamn] och personligen</w:t>
       </w:r>
     </w:p>
     <w:sectPr>

</xml_diff>

<commit_message>
Name CEO Michael Wahren, add personal signature, tie cut-off to termination
- Fills in the individual as Michael Wahren throughout (company name stays
  [Bolagsnamn] placeholder).
- Adds a dedicated personal signature block so Michael Wahren signs in his own
  name personally (key-person undertaking), alongside the party signatures
  (Stefan Charette for Athanase; Michael Wahren for the Swiss company).
- Ties the cut-off to termination of the agreement with the company: on
  termination for any reason, all remuneration including the fixed fee and the
  8 performance units cease with immediate effect, regardless of good/bad
  leaver. Updated both the Avtalstid and performance-units clauses.

Co-Authored-By: Claude Opus 4.8 <noreply@anthropic.com>
Claude-Session: https://claude.ai/code/session_01K14qB8MpeJ8Pk8H1GeEUV4
</commit_message>
<xml_diff>
--- a/Konsultavtal_CEO_template.docx
+++ b/Konsultavtal_CEO_template.docx
@@ -142,7 +142,7 @@
         <w:rPr>
           <w:sz w:val="24"/>
         </w:rPr>
-        <w:t>[Bolagsnamn], ett bolag registrerat i Schweiz, med adress [ange adress], nedan kallat ”Konsulten”. Tjänsterna ska utföras av [Konsultens namn] i egenskap av verkställande direktör (CEO) för Uppdragsgivaren.</w:t>
+        <w:t>[Bolagsnamn], ett bolag registrerat i Schweiz, med adress [ange adress], nedan kallat ”Konsulten”. Tjänsterna ska utföras av Michael Wahren i egenskap av verkställande direktör (CEO) för Uppdragsgivaren.</w:t>
       </w:r>
     </w:p>
     <w:p>
@@ -189,7 +189,7 @@
         <w:rPr>
           <w:sz w:val="24"/>
         </w:rPr>
-        <w:t>Konsulten åtar sig att som självständig konsult tillhandahålla tjänster åt Uppdragsgivaren genom att [Konsultens namn] verkar som verkställande direktör (CEO) för Uppdragsgivaren. I rollen ingår att leda och ansvara för bolagets löpande verksamhet och förvaltning i enlighet med styrelsens och Uppdragsgivarens instruktioner samt gällande rätt.</w:t>
+        <w:t>Konsulten åtar sig att som självständig konsult tillhandahålla tjänster åt Uppdragsgivaren genom att Michael Wahren verkar som verkställande direktör (CEO) för Uppdragsgivaren. I rollen ingår att leda och ansvara för bolagets löpande verksamhet och förvaltning i enlighet med styrelsens och Uppdragsgivarens instruktioner samt gällande rätt.</w:t>
       </w:r>
     </w:p>
     <w:p>
@@ -212,7 +212,7 @@
         <w:rPr>
           <w:sz w:val="24"/>
         </w:rPr>
-        <w:t>Tjänsterna är av personlig natur och ska utföras personligen av [Konsultens namn]. [Konsultens namn] gör genom detta avtal ett personligt åtagande gentemot Uppdragsgivaren att utföra uppdraget och att iaktta de skyldigheter som följer av avtalet, inklusive sekretess och de villkor som gäller för prestationsenheterna. Konsulten får inte ersätta [Konsultens namn] med annan person eller överlåta utförandet av tjänsterna utan Uppdragsgivarens skriftliga medgivande. [Konsultens namn] undertecknar detta avtal såväl för Konsultens räkning som personligen för att bekräfta detta åtagande.</w:t>
+        <w:t>Tjänsterna är av personlig natur och ska utföras personligen av Michael Wahren. Michael Wahren gör genom detta avtal ett personligt åtagande gentemot Uppdragsgivaren att utföra uppdraget och att iaktta de skyldigheter som följer av avtalet, inklusive sekretess och de villkor som gäller för prestationsenheterna. Konsulten får inte ersätta Michael Wahren med annan person eller överlåta utförandet av tjänsterna utan Uppdragsgivarens skriftliga medgivande. Michael Wahren undertecknar detta avtal såväl för Konsultens räkning som personligen för att bekräfta detta åtagande.</w:t>
       </w:r>
     </w:p>
     <w:p>
@@ -252,7 +252,7 @@
         <w:rPr>
           <w:sz w:val="24"/>
         </w:rPr>
-        <w:t>Detta avtal träder i kraft den [startdatum] och upphör automatiskt den [slutdatum]. Båda parter, Uppdragsgivaren och Konsulten, har rätt att avsluta uppdraget omedelbart om vissa kriterier uppfylls, såsom om verksamhetens behov förändras, vid bristande prestation, eller om projektet avslutas i förtid. Om kontraktet avslutas i förtid sker det utan ytterligare kostnader.</w:t>
+        <w:t>Detta avtal träder i kraft den [startdatum] och upphör automatiskt den [slutdatum]. Båda parter, Uppdragsgivaren och Konsulten, har rätt att säga upp och avsluta avtalet med Konsulten omedelbart om vissa kriterier uppfylls, såsom om verksamhetens behov förändras, vid bristande prestation, eller om projektet avslutas i förtid. Om kontraktet avslutas i förtid sker det utan ytterligare kostnader. Vid avtalets upphörande, oavsett orsak, upphör samtliga ersättningar enligt detta avtal – inklusive den fasta ersättningen och prestationsenheterna – att utgå med omedelbar verkan.</w:t>
       </w:r>
     </w:p>
     <w:p>
@@ -311,7 +311,7 @@
         <w:rPr>
           <w:sz w:val="24"/>
         </w:rPr>
-        <w:t>Utöver den fasta ersättningen tilldelas Konsulten 8 prestationsenheter (performance units) i enlighet med Uppdragsgivarens vid var tid gällande ersättningssystem, ”Roles, Responsibilities &amp; Performance Compensation Framework”. Prestationsenheterna är giltiga endast så länge [Konsultens namn] personligen arbetar för och utför tjänsterna åt Uppdragsgivaren. När [Konsultens namn] upphör att arbeta för Uppdragsgivaren upphör samtliga prestationsenheter och därtill hörande rättigheter att gälla med omedelbar verkan, oavsett om [Konsultens namn] anses vara en good leaver eller bad leaver. Prestationsenheterna kan inte överlåtas.</w:t>
+        <w:t>Utöver den fasta ersättningen tilldelas Konsulten 8 prestationsenheter (performance units) i enlighet med Uppdragsgivarens vid var tid gällande ersättningssystem, ”Roles, Responsibilities &amp; Performance Compensation Framework”. Prestationsenheterna är giltiga endast under avtalstiden och så länge Michael Wahren personligen utför tjänsterna åt Uppdragsgivaren. När detta avtal upphör eller sägs upp – oavsett orsak och oavsett om Michael Wahren anses vara en good leaver eller bad leaver – upphör samtliga prestationsenheter och därtill hörande rättigheter att gälla med omedelbar verkan, och ingen ytterligare ersättning utgår avseende dessa. Prestationsenheterna kan inte överlåtas.</w:t>
       </w:r>
     </w:p>
     <w:p>
@@ -923,7 +923,7 @@
           <w:szCs w:val="24"/>
           <w:lang w:val="en-GB"/>
         </w:rPr>
-        <w:t>[Konsultens namn]</w:t>
+        <w:t>Michael Wahren</w:t>
       </w:r>
     </w:p>
     <w:p>
@@ -938,7 +938,53 @@
         <w:tab/>
         <w:tab/>
         <w:tab/>
-        <w:t>för [Bolagsnamn] och personligen</w:t>
+        <w:t>för [Bolagsnamn]</w:t>
+      </w:r>
+    </w:p>
+    <w:p>
+      <w:pPr>
+        <w:pStyle w:val="Brdtext"/>
+      </w:pPr>
+    </w:p>
+    <w:p>
+      <w:pPr>
+        <w:pStyle w:val="Brdtext"/>
+      </w:pPr>
+      <w:r>
+        <w:rPr>
+          <w:b w:val="0"/>
+          <w:sz w:val="24"/>
+        </w:rPr>
+        <w:t>Jag, Michael Wahren, undertecknar detta avtal även personligen för att bekräfta mitt personliga åtagande enligt avtalet.</w:t>
+      </w:r>
+    </w:p>
+    <w:p>
+      <w:pPr>
+        <w:pStyle w:val="Brdtext"/>
+      </w:pPr>
+    </w:p>
+    <w:p>
+      <w:pPr>
+        <w:pStyle w:val="Brdtext"/>
+      </w:pPr>
+      <w:r>
+        <w:rPr>
+          <w:b w:val="0"/>
+          <w:sz w:val="24"/>
+        </w:rPr>
+        <w:t>______________________</w:t>
+      </w:r>
+    </w:p>
+    <w:p>
+      <w:pPr>
+        <w:pStyle w:val="Brdtext"/>
+      </w:pPr>
+      <w:r>
+        <w:rPr>
+          <w:b w:val="0"/>
+          <w:sz w:val="24"/>
+        </w:rPr>
+        <w:t>Michael Wahren (personligen)</w:t>
       </w:r>
     </w:p>
     <w:sectPr>

</xml_diff>